<commit_message>
detalha laboratório Docker da Aula 2 e remove polyfill externo
</commit_message>
<xml_diff>
--- a/atividades/A02-ativos-ameacas-e-vulnerabilidades/fonte/A02-ativos-ameacas-e-vulnerabilidades.docx
+++ b/atividades/A02-ativos-ameacas-e-vulnerabilidades/fonte/A02-ativos-ameacas-e-vulnerabilidades.docx
@@ -250,7 +250,7 @@
           <w:sz w:val="24"/>
           <w:szCs w:val="24"/>
         </w:rPr>
-        <w:t xml:space="preserve">Inventariar ativos de TI e OT relacionando função e consequência.</w:t>
+        <w:t xml:space="preserve">Inventariar os ativos do ambiente Juice Shop relacionando função e consequência.</w:t>
       </w:r>
     </w:p>
     <w:p>
@@ -332,7 +332,7 @@
           <w:sz w:val="24"/>
           <w:szCs w:val="24"/>
         </w:rPr>
-        <w:t xml:space="preserve">Juice Shop local no endereço informado pelo professor.</w:t>
+        <w:t xml:space="preserve">Docker Desktop iniciado no Windows ou Docker Engine em execução no Linux.</w:t>
       </w:r>
     </w:p>
     <w:p>
@@ -351,6 +351,24 @@
           <w:szCs w:val="24"/>
         </w:rPr>
         <w:t xml:space="preserve">Navegador com DevTools; Burp Community é opcional.</w:t>
+      </w:r>
+    </w:p>
+    <w:p>
+      <w:pPr>
+        <w:pStyle w:val="ListParagraph"/>
+        <w:numPr>
+          <w:ilvl w:val="0"/>
+          <w:numId w:val="1"/>
+        </w:numPr>
+        <w:spacing w:after="85" w:line="315"/>
+      </w:pPr>
+      <w:r>
+        <w:rPr>
+          <w:color w:val="172B4D"/>
+          <w:sz w:val="24"/>
+          <w:szCs w:val="24"/>
+        </w:rPr>
+        <w:t xml:space="preserve">Acesso para baixar a imagem antes da aula; depois do download, a prática pode continuar localmente.</w:t>
       </w:r>
     </w:p>
     <w:p>
@@ -489,79 +507,136 @@
         <w:spacing w:after="100" w:before="220"/>
       </w:pPr>
       <w:r>
-        <w:t xml:space="preserve">Etapa 1 — Preparar e verificar (8 min)</w:t>
-      </w:r>
-    </w:p>
-    <w:p>
-      <w:pPr>
-        <w:pStyle w:val="ListParagraph"/>
-        <w:numPr>
-          <w:ilvl w:val="0"/>
-          <w:numId w:val="1"/>
-        </w:numPr>
-        <w:spacing w:after="85" w:line="315"/>
-      </w:pPr>
-      <w:r>
-        <w:rPr>
-          <w:color w:val="172B4D"/>
-          <w:sz w:val="24"/>
-          <w:szCs w:val="24"/>
-        </w:rPr>
-        <w:t xml:space="preserve">Copie do quadro o endereço exato do alvo local; confirme protocolo, host e porta.</w:t>
-      </w:r>
-    </w:p>
-    <w:p>
-      <w:pPr>
-        <w:pStyle w:val="ListParagraph"/>
-        <w:numPr>
-          <w:ilvl w:val="0"/>
-          <w:numId w:val="1"/>
-        </w:numPr>
-        <w:spacing w:after="85" w:line="315"/>
-      </w:pPr>
-      <w:r>
-        <w:rPr>
-          <w:color w:val="172B4D"/>
-          <w:sz w:val="24"/>
-          <w:szCs w:val="24"/>
-        </w:rPr>
-        <w:t xml:space="preserve">Abra a página inicial e registre somente versão/identificação exibida sem dados sensíveis.</w:t>
-      </w:r>
-    </w:p>
-    <w:p>
-      <w:pPr>
-        <w:pStyle w:val="ListParagraph"/>
-        <w:numPr>
-          <w:ilvl w:val="0"/>
-          <w:numId w:val="1"/>
-        </w:numPr>
-        <w:spacing w:after="85" w:line="315"/>
-      </w:pPr>
-      <w:r>
-        <w:rPr>
-          <w:color w:val="172B4D"/>
-          <w:sz w:val="24"/>
-          <w:szCs w:val="24"/>
-        </w:rPr>
-        <w:t xml:space="preserve">Definam papéis: investigador opera; revisor confere escopo e anota. Troquem depois da Etapa 2.</w:t>
-      </w:r>
-    </w:p>
-    <w:p>
-      <w:pPr>
-        <w:pStyle w:val="ListParagraph"/>
-        <w:numPr>
-          <w:ilvl w:val="0"/>
-          <w:numId w:val="1"/>
-        </w:numPr>
-        <w:spacing w:after="85" w:line="315"/>
-      </w:pPr>
-      <w:r>
-        <w:rPr>
-          <w:color w:val="172B4D"/>
-          <w:sz w:val="24"/>
-          <w:szCs w:val="24"/>
-        </w:rPr>
-        <w:t xml:space="preserve">Se a página não abrir ou o destino não for o indicado, use a evidência alternativa e não improvise.</w:t>
+        <w:t xml:space="preserve">Etapa 1 — Subir o Juice Shop localmente (12 min)</w:t>
+      </w:r>
+    </w:p>
+    <w:p>
+      <w:pPr>
+        <w:spacing w:after="120" w:line="330"/>
+      </w:pPr>
+      <w:r>
+        <w:rPr>
+          <w:color w:val="172B4D"/>
+          <w:sz w:val="24"/>
+          <w:szCs w:val="24"/>
+        </w:rPr>
+        <w:t xml:space="preserve">Os comandos Docker são iguais no PowerShell do Windows e no terminal Linux. No Windows, abra primeiro o Docker Desktop em modo de containers Linux. No Linux, confirme que o Docker Engine está ativo.</w:t>
+      </w:r>
+    </w:p>
+    <w:p>
+      <w:pPr>
+        <w:spacing w:after="120" w:line="330"/>
+      </w:pPr>
+      <w:r>
+        <w:rPr>
+          <w:color w:val="172B4D"/>
+          <w:sz w:val="24"/>
+          <w:szCs w:val="24"/>
+        </w:rPr>
+        <w:t xml:space="preserve">1. Confirme que o cliente consegue falar com o mecanismo Docker:</w:t>
+      </w:r>
+    </w:p>
+    <w:p>
+      <w:pPr>
+        <w:shd w:fill="0D2235" w:val="clear"/>
+        <w:spacing w:after="110" w:before="50" w:line="280"/>
+        <w:ind w:left="180" w:right="180"/>
+      </w:pPr>
+      <w:r>
+        <w:rPr>
+          <w:rFonts w:ascii="Consolas" w:cs="Consolas" w:eastAsia="Consolas" w:hAnsi="Consolas"/>
+          <w:color w:val="D8F3EA"/>
+          <w:sz w:val="20"/>
+          <w:szCs w:val="20"/>
+        </w:rPr>
+        <w:t xml:space="preserve">docker version</w:t>
+      </w:r>
+    </w:p>
+    <w:p>
+      <w:pPr>
+        <w:spacing w:after="120" w:line="330"/>
+      </w:pPr>
+      <w:r>
+        <w:rPr>
+          <w:color w:val="172B4D"/>
+          <w:sz w:val="24"/>
+          <w:szCs w:val="24"/>
+        </w:rPr>
+        <w:t xml:space="preserve">2. Baixe a imagem oficial usada pelo guia do OWASP Juice Shop:</w:t>
+      </w:r>
+    </w:p>
+    <w:p>
+      <w:pPr>
+        <w:shd w:fill="0D2235" w:val="clear"/>
+        <w:spacing w:after="110" w:before="50" w:line="280"/>
+        <w:ind w:left="180" w:right="180"/>
+      </w:pPr>
+      <w:r>
+        <w:rPr>
+          <w:rFonts w:ascii="Consolas" w:cs="Consolas" w:eastAsia="Consolas" w:hAnsi="Consolas"/>
+          <w:color w:val="D8F3EA"/>
+          <w:sz w:val="20"/>
+          <w:szCs w:val="20"/>
+        </w:rPr>
+        <w:t xml:space="preserve">docker pull bkimminich/juice-shop</w:t>
+      </w:r>
+    </w:p>
+    <w:p>
+      <w:pPr>
+        <w:spacing w:after="120" w:line="330"/>
+      </w:pPr>
+      <w:r>
+        <w:rPr>
+          <w:color w:val="172B4D"/>
+          <w:sz w:val="24"/>
+          <w:szCs w:val="24"/>
+        </w:rPr>
+        <w:t xml:space="preserve">3. Inicie um container acessível somente pela própria máquina:</w:t>
+      </w:r>
+    </w:p>
+    <w:p>
+      <w:pPr>
+        <w:shd w:fill="0D2235" w:val="clear"/>
+        <w:spacing w:after="110" w:before="50" w:line="280"/>
+        <w:ind w:left="180" w:right="180"/>
+      </w:pPr>
+      <w:r>
+        <w:rPr>
+          <w:rFonts w:ascii="Consolas" w:cs="Consolas" w:eastAsia="Consolas" w:hAnsi="Consolas"/>
+          <w:color w:val="D8F3EA"/>
+          <w:sz w:val="20"/>
+          <w:szCs w:val="20"/>
+        </w:rPr>
+        <w:t xml:space="preserve">docker run --rm -d --name juice-shop-a02 -p 127.0.0.1:3000:3000 bkimminich/juice-shop</w:t>
+      </w:r>
+    </w:p>
+    <w:p>
+      <w:pPr>
+        <w:spacing w:after="120" w:line="330"/>
+      </w:pPr>
+      <w:r>
+        <w:rPr>
+          <w:color w:val="172B4D"/>
+          <w:sz w:val="24"/>
+          <w:szCs w:val="24"/>
+        </w:rPr>
+        <w:t xml:space="preserve">4. Confirme o estado e aguarde a coluna STATUS indicar que o container está em execução:</w:t>
+      </w:r>
+    </w:p>
+    <w:p>
+      <w:pPr>
+        <w:shd w:fill="0D2235" w:val="clear"/>
+        <w:spacing w:after="110" w:before="50" w:line="280"/>
+        <w:ind w:left="180" w:right="180"/>
+      </w:pPr>
+      <w:r>
+        <w:rPr>
+          <w:rFonts w:ascii="Consolas" w:cs="Consolas" w:eastAsia="Consolas" w:hAnsi="Consolas"/>
+          <w:color w:val="D8F3EA"/>
+          <w:sz w:val="20"/>
+          <w:szCs w:val="20"/>
+        </w:rPr>
+        <w:t xml:space="preserve">docker ps --filter name=juice-shop-a02</w:t>
       </w:r>
     </w:p>
     <w:tbl>
@@ -582,7 +657,7 @@
       <w:tr>
         <w:tc>
           <w:tcPr>
-            <w:shd w:fill="0B65C2" w:val="clear"/>
+            <w:shd w:fill="B42318" w:val="clear"/>
             <w:tcMar>
               <w:top w:type="dxa" w:w="145"/>
               <w:left w:type="dxa" w:w="180"/>
@@ -602,7 +677,7 @@
                 <w:sz w:val="23"/>
                 <w:szCs w:val="23"/>
               </w:rPr>
-              <w:t xml:space="preserve">EVIDÊNCIA</w:t>
+              <w:t xml:space="preserve">ATENÇÃO</w:t>
             </w:r>
           </w:p>
           <w:p>
@@ -615,7 +690,7 @@
                 <w:sz w:val="23"/>
                 <w:szCs w:val="23"/>
               </w:rPr>
-              <w:t xml:space="preserve">Estado inicial: alvo sanitizado, horário relativo e confirmação de que a página inicial responde. Não capture credenciais, tokens, cookies ou IP público.</w:t>
+              <w:t xml:space="preserve">O vínculo 127.0.0.1 limita o serviço ao computador local. Não substitua por 0.0.0.0, não publique a porta no roteador e não use a demonstração pública do Juice Shop como alvo.</w:t>
             </w:r>
           </w:p>
         </w:tc>
@@ -628,7 +703,331 @@
         <w:spacing w:after="100" w:before="220"/>
       </w:pPr>
       <w:r>
-        <w:t xml:space="preserve">Etapa 2 — Observar sem enumerar (12 min)</w:t>
+        <w:t xml:space="preserve">Windows — PowerShell</w:t>
+      </w:r>
+    </w:p>
+    <w:p>
+      <w:pPr>
+        <w:pStyle w:val="ListParagraph"/>
+        <w:numPr>
+          <w:ilvl w:val="0"/>
+          <w:numId w:val="1"/>
+        </w:numPr>
+        <w:spacing w:after="85" w:line="315"/>
+      </w:pPr>
+      <w:r>
+        <w:rPr>
+          <w:color w:val="172B4D"/>
+          <w:sz w:val="24"/>
+          <w:szCs w:val="24"/>
+        </w:rPr>
+        <w:t xml:space="preserve">Inicie o Docker Desktop e aguarde a indicação de que o mecanismo está ativo.</w:t>
+      </w:r>
+    </w:p>
+    <w:p>
+      <w:pPr>
+        <w:pStyle w:val="ListParagraph"/>
+        <w:numPr>
+          <w:ilvl w:val="0"/>
+          <w:numId w:val="1"/>
+        </w:numPr>
+        <w:spacing w:after="85" w:line="315"/>
+      </w:pPr>
+      <w:r>
+        <w:rPr>
+          <w:color w:val="172B4D"/>
+          <w:sz w:val="24"/>
+          <w:szCs w:val="24"/>
+        </w:rPr>
+        <w:t xml:space="preserve">Execute os quatro comandos acima no PowerShell, sem acrescentar sudo.</w:t>
+      </w:r>
+    </w:p>
+    <w:p>
+      <w:pPr>
+        <w:pStyle w:val="ListParagraph"/>
+        <w:numPr>
+          <w:ilvl w:val="0"/>
+          <w:numId w:val="1"/>
+        </w:numPr>
+        <w:spacing w:after="85" w:line="315"/>
+      </w:pPr>
+      <w:r>
+        <w:rPr>
+          <w:color w:val="172B4D"/>
+          <w:sz w:val="24"/>
+          <w:szCs w:val="24"/>
+        </w:rPr>
+        <w:t xml:space="preserve">Abra http://127.0.0.1:3000 no navegador. Se o Docker estiver em modo de containers Windows, altere para containers Linux.</w:t>
+      </w:r>
+    </w:p>
+    <w:p>
+      <w:pPr>
+        <w:pStyle w:val="Heading2"/>
+        <w:keepNext/>
+        <w:spacing w:after="100" w:before="220"/>
+      </w:pPr>
+      <w:r>
+        <w:t xml:space="preserve">Linux — terminal</w:t>
+      </w:r>
+    </w:p>
+    <w:p>
+      <w:pPr>
+        <w:pStyle w:val="ListParagraph"/>
+        <w:numPr>
+          <w:ilvl w:val="0"/>
+          <w:numId w:val="1"/>
+        </w:numPr>
+        <w:spacing w:after="85" w:line="315"/>
+      </w:pPr>
+      <w:r>
+        <w:rPr>
+          <w:color w:val="172B4D"/>
+          <w:sz w:val="24"/>
+          <w:szCs w:val="24"/>
+        </w:rPr>
+        <w:t xml:space="preserve">Execute docker version. Se houver erro de conexão, inicie o serviço conforme a instalação da sua distribuição ou peça apoio ao professor.</w:t>
+      </w:r>
+    </w:p>
+    <w:p>
+      <w:pPr>
+        <w:pStyle w:val="ListParagraph"/>
+        <w:numPr>
+          <w:ilvl w:val="0"/>
+          <w:numId w:val="1"/>
+        </w:numPr>
+        <w:spacing w:after="85" w:line="315"/>
+      </w:pPr>
+      <w:r>
+        <w:rPr>
+          <w:color w:val="172B4D"/>
+          <w:sz w:val="24"/>
+          <w:szCs w:val="24"/>
+        </w:rPr>
+        <w:t xml:space="preserve">Execute os quatro comandos acima. Use sudo somente se essa for a configuração institucional definida para o laboratório.</w:t>
+      </w:r>
+    </w:p>
+    <w:p>
+      <w:pPr>
+        <w:pStyle w:val="ListParagraph"/>
+        <w:numPr>
+          <w:ilvl w:val="0"/>
+          <w:numId w:val="1"/>
+        </w:numPr>
+        <w:spacing w:after="85" w:line="315"/>
+      </w:pPr>
+      <w:r>
+        <w:rPr>
+          <w:color w:val="172B4D"/>
+          <w:sz w:val="24"/>
+          <w:szCs w:val="24"/>
+        </w:rPr>
+        <w:t xml:space="preserve">Abra http://127.0.0.1:3000 no navegador.</w:t>
+      </w:r>
+    </w:p>
+    <w:tbl>
+      <w:tblPr>
+        <w:tblW w:type="pct" w:w="100%"/>
+        <w:tblBorders>
+          <w:top w:val="single" w:color="auto" w:sz="4"/>
+          <w:left w:val="single" w:color="auto" w:sz="4"/>
+          <w:bottom w:val="single" w:color="auto" w:sz="4"/>
+          <w:right w:val="single" w:color="auto" w:sz="4"/>
+          <w:insideH w:val="single" w:color="auto" w:sz="4"/>
+          <w:insideV w:val="single" w:color="auto" w:sz="4"/>
+        </w:tblBorders>
+      </w:tblPr>
+      <w:tblGrid>
+        <w:gridCol w:w="100"/>
+      </w:tblGrid>
+      <w:tr>
+        <w:tc>
+          <w:tcPr>
+            <w:shd w:fill="087F7A" w:val="clear"/>
+            <w:tcMar>
+              <w:top w:type="dxa" w:w="145"/>
+              <w:left w:type="dxa" w:w="180"/>
+              <w:bottom w:type="dxa" w:w="145"/>
+              <w:right w:type="dxa" w:w="180"/>
+            </w:tcMar>
+          </w:tcPr>
+          <w:p>
+            <w:pPr>
+              <w:spacing w:after="65"/>
+            </w:pPr>
+            <w:r>
+              <w:rPr>
+                <w:b/>
+                <w:bCs/>
+                <w:color w:val="FFFFFF"/>
+                <w:sz w:val="23"/>
+                <w:szCs w:val="23"/>
+              </w:rPr>
+              <w:t xml:space="preserve">PISTA</w:t>
+            </w:r>
+          </w:p>
+          <w:p>
+            <w:pPr>
+              <w:spacing w:line="315"/>
+            </w:pPr>
+            <w:r>
+              <w:rPr>
+                <w:color w:val="FFFFFF"/>
+                <w:sz w:val="23"/>
+                <w:szCs w:val="23"/>
+              </w:rPr>
+              <w:t xml:space="preserve">Se a porta 3000 já estiver ocupada, pare e confirme com o professor. Quando autorizado, use -p 127.0.0.1:3001:3000 e acesse http://127.0.0.1:3001.</w:t>
+            </w:r>
+          </w:p>
+        </w:tc>
+      </w:tr>
+    </w:tbl>
+    <w:p>
+      <w:pPr>
+        <w:pStyle w:val="Heading2"/>
+        <w:keepNext/>
+        <w:spacing w:after="100" w:before="220"/>
+      </w:pPr>
+      <w:r>
+        <w:t xml:space="preserve">Etapa 2 — Verificar o alvo e organizar a dupla (5 min)</w:t>
+      </w:r>
+    </w:p>
+    <w:p>
+      <w:pPr>
+        <w:pStyle w:val="ListParagraph"/>
+        <w:numPr>
+          <w:ilvl w:val="0"/>
+          <w:numId w:val="1"/>
+        </w:numPr>
+        <w:spacing w:after="85" w:line="315"/>
+      </w:pPr>
+      <w:r>
+        <w:rPr>
+          <w:color w:val="172B4D"/>
+          <w:sz w:val="24"/>
+          <w:szCs w:val="24"/>
+        </w:rPr>
+        <w:t xml:space="preserve">Confirme que a barra de endereço mostra exatamente 127.0.0.1 e a porta escolhida.</w:t>
+      </w:r>
+    </w:p>
+    <w:p>
+      <w:pPr>
+        <w:pStyle w:val="ListParagraph"/>
+        <w:numPr>
+          <w:ilvl w:val="0"/>
+          <w:numId w:val="1"/>
+        </w:numPr>
+        <w:spacing w:after="85" w:line="315"/>
+      </w:pPr>
+      <w:r>
+        <w:rPr>
+          <w:color w:val="172B4D"/>
+          <w:sz w:val="24"/>
+          <w:szCs w:val="24"/>
+        </w:rPr>
+        <w:t xml:space="preserve">Registre o estado inicial sem capturar cookies, tokens ou credenciais.</w:t>
+      </w:r>
+    </w:p>
+    <w:p>
+      <w:pPr>
+        <w:pStyle w:val="ListParagraph"/>
+        <w:numPr>
+          <w:ilvl w:val="0"/>
+          <w:numId w:val="1"/>
+        </w:numPr>
+        <w:spacing w:after="85" w:line="315"/>
+      </w:pPr>
+      <w:r>
+        <w:rPr>
+          <w:color w:val="172B4D"/>
+          <w:sz w:val="24"/>
+          <w:szCs w:val="24"/>
+        </w:rPr>
+        <w:t xml:space="preserve">Definam papéis: investigador opera; revisor confere escopo e anota. Troquem depois da observação.</w:t>
+      </w:r>
+    </w:p>
+    <w:p>
+      <w:pPr>
+        <w:pStyle w:val="ListParagraph"/>
+        <w:numPr>
+          <w:ilvl w:val="0"/>
+          <w:numId w:val="1"/>
+        </w:numPr>
+        <w:spacing w:after="85" w:line="315"/>
+      </w:pPr>
+      <w:r>
+        <w:rPr>
+          <w:color w:val="172B4D"/>
+          <w:sz w:val="24"/>
+          <w:szCs w:val="24"/>
+        </w:rPr>
+        <w:t xml:space="preserve">Se a página não abrir, consulte docker logs --tail 30 juice-shop-a02. Não improvise contra outro endereço.</w:t>
+      </w:r>
+    </w:p>
+    <w:tbl>
+      <w:tblPr>
+        <w:tblW w:type="pct" w:w="100%"/>
+        <w:tblBorders>
+          <w:top w:val="single" w:color="auto" w:sz="4"/>
+          <w:left w:val="single" w:color="auto" w:sz="4"/>
+          <w:bottom w:val="single" w:color="auto" w:sz="4"/>
+          <w:right w:val="single" w:color="auto" w:sz="4"/>
+          <w:insideH w:val="single" w:color="auto" w:sz="4"/>
+          <w:insideV w:val="single" w:color="auto" w:sz="4"/>
+        </w:tblBorders>
+      </w:tblPr>
+      <w:tblGrid>
+        <w:gridCol w:w="100"/>
+      </w:tblGrid>
+      <w:tr>
+        <w:tc>
+          <w:tcPr>
+            <w:shd w:fill="0B65C2" w:val="clear"/>
+            <w:tcMar>
+              <w:top w:type="dxa" w:w="145"/>
+              <w:left w:type="dxa" w:w="180"/>
+              <w:bottom w:type="dxa" w:w="145"/>
+              <w:right w:type="dxa" w:w="180"/>
+            </w:tcMar>
+          </w:tcPr>
+          <w:p>
+            <w:pPr>
+              <w:spacing w:after="65"/>
+            </w:pPr>
+            <w:r>
+              <w:rPr>
+                <w:b/>
+                <w:bCs/>
+                <w:color w:val="FFFFFF"/>
+                <w:sz w:val="23"/>
+                <w:szCs w:val="23"/>
+              </w:rPr>
+              <w:t xml:space="preserve">EVIDÊNCIA</w:t>
+            </w:r>
+          </w:p>
+          <w:p>
+            <w:pPr>
+              <w:spacing w:line="315"/>
+            </w:pPr>
+            <w:r>
+              <w:rPr>
+                <w:color w:val="FFFFFF"/>
+                <w:sz w:val="23"/>
+                <w:szCs w:val="23"/>
+              </w:rPr>
+              <w:t xml:space="preserve">Estado inicial: alvo sanitizado, horário relativo e confirmação de que a página inicial responde. Não capture credenciais, tokens, cookies ou IP público.</w:t>
+            </w:r>
+          </w:p>
+        </w:tc>
+      </w:tr>
+    </w:tbl>
+    <w:p>
+      <w:pPr>
+        <w:pStyle w:val="Heading2"/>
+        <w:keepNext/>
+        <w:spacing w:after="100" w:before="220"/>
+      </w:pPr>
+      <w:r>
+        <w:t xml:space="preserve">Etapa 3 — Observar sem enumerar (10 min)</w:t>
       </w:r>
     </w:p>
     <w:p>
@@ -765,7 +1164,7 @@
         <w:spacing w:after="100" w:before="220"/>
       </w:pPr>
       <w:r>
-        <w:t xml:space="preserve">Etapa 3 — Inventariar e interpretar (12 min)</w:t>
+        <w:t xml:space="preserve">Etapa 4 — Inventariar e interpretar (8 min)</w:t>
       </w:r>
     </w:p>
     <w:p>
@@ -778,7 +1177,7 @@
           <w:sz w:val="24"/>
           <w:szCs w:val="24"/>
         </w:rPr>
-        <w:t xml:space="preserve">Preencha ao menos quatro linhas. Inclua o recurso observado, a aplicação, a plataforma e um ativo OT de transferência.</w:t>
+        <w:t xml:space="preserve">Preencha ao menos quatro linhas usando somente o ambiente investigado: o arquivo ou recurso observado, a aplicação/rota, os dados relacionados e o container ou plataforma. Para cada ativo, explique função, responsável provável, consequência e evidência.</w:t>
       </w:r>
     </w:p>
     <w:tbl>
@@ -1360,7 +1759,7 @@
         <w:spacing w:after="100" w:before="220"/>
       </w:pPr>
       <w:r>
-        <w:t xml:space="preserve">Etapa 4 — Registrar a vulnerabilidade (10 min)</w:t>
+        <w:t xml:space="preserve">Etapa 5 — Registrar a vulnerabilidade (9 min)</w:t>
       </w:r>
     </w:p>
     <w:p>
@@ -1796,7 +2195,7 @@
         <w:spacing w:after="100" w:before="220"/>
       </w:pPr>
       <w:r>
-        <w:t xml:space="preserve">Etapa 5 — Tratar e validar (10 min)</w:t>
+        <w:t xml:space="preserve">Etapa 6 — Tratar e validar (8 min)</w:t>
       </w:r>
     </w:p>
     <w:p>
@@ -2979,6 +3378,35 @@
     </w:p>
     <w:p>
       <w:pPr>
+        <w:spacing w:after="120" w:line="330"/>
+      </w:pPr>
+      <w:r>
+        <w:rPr>
+          <w:color w:val="172B4D"/>
+          <w:sz w:val="24"/>
+          <w:szCs w:val="24"/>
+        </w:rPr>
+        <w:t xml:space="preserve">Windows PowerShell e Linux usam o mesmo comando para parar o container:</w:t>
+      </w:r>
+    </w:p>
+    <w:p>
+      <w:pPr>
+        <w:shd w:fill="0D2235" w:val="clear"/>
+        <w:spacing w:after="110" w:before="50" w:line="280"/>
+        <w:ind w:left="180" w:right="180"/>
+      </w:pPr>
+      <w:r>
+        <w:rPr>
+          <w:rFonts w:ascii="Consolas" w:cs="Consolas" w:eastAsia="Consolas" w:hAnsi="Consolas"/>
+          <w:color w:val="D8F3EA"/>
+          <w:sz w:val="20"/>
+          <w:szCs w:val="20"/>
+        </w:rPr>
+        <w:t xml:space="preserve">docker stop juice-shop-a02</w:t>
+      </w:r>
+    </w:p>
+    <w:p>
+      <w:pPr>
         <w:pStyle w:val="ListParagraph"/>
         <w:numPr>
           <w:ilvl w:val="0"/>
@@ -2992,7 +3420,7 @@
           <w:sz w:val="24"/>
           <w:szCs w:val="24"/>
         </w:rPr>
-        <w:t xml:space="preserve">Feche DevTools e descarte capturas que contenham cookies, tokens ou dados não sanitizados.</w:t>
+        <w:t xml:space="preserve">Confirme que docker ps --filter name=juice-shop-a02 não lista o container em execução.</w:t>
       </w:r>
     </w:p>
     <w:p>
@@ -3010,7 +3438,7 @@
           <w:sz w:val="24"/>
           <w:szCs w:val="24"/>
         </w:rPr>
-        <w:t xml:space="preserve">Se você iniciou o Juice Shop, encerre o processo ou container pelo procedimento informado.</w:t>
+        <w:t xml:space="preserve">Como foi usado --rm, o container é removido automaticamente após a parada; a imagem permanece para reutilização.</w:t>
       </w:r>
     </w:p>
     <w:p>
@@ -3028,7 +3456,7 @@
           <w:sz w:val="24"/>
           <w:szCs w:val="24"/>
         </w:rPr>
-        <w:t xml:space="preserve">Confirme que a porta do serviço vulnerável não ficou acessível fora do laboratório.</w:t>
+        <w:t xml:space="preserve">Feche DevTools e descarte capturas que contenham cookies, tokens ou dados não sanitizados.</w:t>
       </w:r>
     </w:p>
     <w:p>
@@ -3046,7 +3474,7 @@
           <w:sz w:val="24"/>
           <w:szCs w:val="24"/>
         </w:rPr>
-        <w:t xml:space="preserve">Preserve somente o PDF sanitizado da entrega.</w:t>
+        <w:t xml:space="preserve">Confirme que http://127.0.0.1:3000 não responde mais e preserve somente o PDF sanitizado.</w:t>
       </w:r>
     </w:p>
     <w:p>
@@ -3120,7 +3548,7 @@
           <w:sz w:val="24"/>
           <w:szCs w:val="24"/>
         </w:rPr>
-        <w:t xml:space="preserve">NIST CSF 2.0 — https://doi.org/10.6028/NIST.CSWP.29</w:t>
+        <w:t xml:space="preserve">OWASP Juice Shop — execução com Docker: https://pwning.owasp-juice.shop/companion-guide/latest/part1/running.html</w:t>
       </w:r>
     </w:p>
     <w:p>
@@ -3138,7 +3566,7 @@
           <w:sz w:val="24"/>
           <w:szCs w:val="24"/>
         </w:rPr>
-        <w:t xml:space="preserve">CVE Program — https://www.cve.org/</w:t>
+        <w:t xml:space="preserve">Docker Desktop para Windows: https://docs.docker.com/desktop/setup/install/windows-install/</w:t>
       </w:r>
     </w:p>
     <w:p>
@@ -3156,7 +3584,7 @@
           <w:sz w:val="24"/>
           <w:szCs w:val="24"/>
         </w:rPr>
-        <w:t xml:space="preserve">CWE — https://cwe.mitre.org/</w:t>
+        <w:t xml:space="preserve">Docker Engine para Linux: https://docs.docker.com/engine/install/</w:t>
       </w:r>
     </w:p>
     <w:p>
@@ -3174,7 +3602,43 @@
           <w:sz w:val="24"/>
           <w:szCs w:val="24"/>
         </w:rPr>
-        <w:t xml:space="preserve">OWASP Juice Shop — https://owasp.org/www-project-juice-shop/</w:t>
+        <w:t xml:space="preserve">NIST CSF 2.0 — https://doi.org/10.6028/NIST.CSWP.29</w:t>
+      </w:r>
+    </w:p>
+    <w:p>
+      <w:pPr>
+        <w:pStyle w:val="ListParagraph"/>
+        <w:numPr>
+          <w:ilvl w:val="0"/>
+          <w:numId w:val="1"/>
+        </w:numPr>
+        <w:spacing w:after="85" w:line="315"/>
+      </w:pPr>
+      <w:r>
+        <w:rPr>
+          <w:color w:val="172B4D"/>
+          <w:sz w:val="24"/>
+          <w:szCs w:val="24"/>
+        </w:rPr>
+        <w:t xml:space="preserve">CVE Program — https://www.cve.org/</w:t>
+      </w:r>
+    </w:p>
+    <w:p>
+      <w:pPr>
+        <w:pStyle w:val="ListParagraph"/>
+        <w:numPr>
+          <w:ilvl w:val="0"/>
+          <w:numId w:val="1"/>
+        </w:numPr>
+        <w:spacing w:after="85" w:line="315"/>
+      </w:pPr>
+      <w:r>
+        <w:rPr>
+          <w:color w:val="172B4D"/>
+          <w:sz w:val="24"/>
+          <w:szCs w:val="24"/>
+        </w:rPr>
+        <w:t xml:space="preserve">CWE — https://cwe.mitre.org/</w:t>
       </w:r>
     </w:p>
     <w:sectPr>

</xml_diff>

<commit_message>
reorganiza progressão conceitual da Aula 2
</commit_message>
<xml_diff>
--- a/atividades/A02-ativos-ameacas-e-vulnerabilidades/fonte/A02-ativos-ameacas-e-vulnerabilidades.docx
+++ b/atividades/A02-ativos-ameacas-e-vulnerabilidades/fonte/A02-ativos-ameacas-e-vulnerabilidades.docx
@@ -453,7 +453,7 @@
         <w:spacing w:after="100" w:before="220"/>
       </w:pPr>
       <w:r>
-        <w:t xml:space="preserve">Hipótese inicial</w:t>
+        <w:t xml:space="preserve">Previsão inicial</w:t>
       </w:r>
     </w:p>
     <w:p>
@@ -466,7 +466,7 @@
           <w:sz w:val="24"/>
           <w:szCs w:val="24"/>
         </w:rPr>
-        <w:t xml:space="preserve">Antes de executar, registre qual recurso pode estar exposto, por que isso seria possível e qual resposta confirmaria ou refutaria sua hipótese.</w:t>
+        <w:t xml:space="preserve">A rota será fornecida; não é preciso descobri-la. Antes de acessar, preveja: a requisição será aceita sem login? Que resposta indicaria entrega do arquivo? O que essa resposta ainda não permitiria concluir?</w:t>
       </w:r>
     </w:p>
     <w:p>
@@ -479,7 +479,7 @@
           <w:sz w:val="24"/>
           <w:szCs w:val="24"/>
         </w:rPr>
-        <w:t xml:space="preserve">Hipótese: __________________________________________________________________</w:t>
+        <w:t xml:space="preserve">Resposta esperada: __________________________________________________________</w:t>
       </w:r>
     </w:p>
     <w:p>
@@ -492,7 +492,7 @@
           <w:sz w:val="24"/>
           <w:szCs w:val="24"/>
         </w:rPr>
-        <w:t xml:space="preserve">Evidência esperada: __________________________________________________________</w:t>
+        <w:t xml:space="preserve">Limite da conclusão: _________________________________________________________</w:t>
       </w:r>
     </w:p>
     <w:p>
@@ -1027,7 +1027,7 @@
         <w:spacing w:after="100" w:before="220"/>
       </w:pPr>
       <w:r>
-        <w:t xml:space="preserve">Etapa 3 — Observar sem enumerar (10 min)</w:t>
+        <w:t xml:space="preserve">Etapa 3 — Executar a requisição guiada (12 min)</w:t>
       </w:r>
     </w:p>
     <w:p>
@@ -1040,7 +1040,37 @@
           <w:sz w:val="24"/>
           <w:szCs w:val="24"/>
         </w:rPr>
-        <w:t xml:space="preserve">Com DevTools na aba Network, observe uma requisição orientada pelo professor. Execute uma tentativa por vez. Registre método, caminho relativo, status, tipo de conteúdo e o que a resposta demonstra. Não use scanner, força bruta ou lista de caminhos.</w:t>
+        <w:t xml:space="preserve">O professor executará a primeira vez com a turma. Abra DevTools, selecione Network, marque Preserve log e acesse exatamente http://127.0.0.1:3000/ftp/acquisitions.md. Não procure outras rotas.</w:t>
+      </w:r>
+    </w:p>
+    <w:p>
+      <w:pPr>
+        <w:shd w:fill="0D2235" w:val="clear"/>
+        <w:spacing w:after="110" w:before="50" w:line="280"/>
+        <w:ind w:left="180" w:right="180"/>
+      </w:pPr>
+      <w:r>
+        <w:rPr>
+          <w:rFonts w:ascii="Consolas" w:cs="Consolas" w:eastAsia="Consolas" w:hAnsi="Consolas"/>
+          <w:color w:val="D8F3EA"/>
+          <w:sz w:val="20"/>
+          <w:szCs w:val="20"/>
+        </w:rPr>
+        <w:t xml:space="preserve">GET /ftp/acquisitions.md HTTP/1.1
+Host: 127.0.0.1:3000</w:t>
+      </w:r>
+    </w:p>
+    <w:p>
+      <w:pPr>
+        <w:spacing w:after="120" w:line="330"/>
+      </w:pPr>
+      <w:r>
+        <w:rPr>
+          <w:color w:val="172B4D"/>
+          <w:sz w:val="24"/>
+          <w:szCs w:val="24"/>
+        </w:rPr>
+        <w:t xml:space="preserve">Localize a requisição e registre: método GET; caminho /ftp/acquisitions.md; status observado; Content-Type; presença ou ausência de autenticação; uma frase do documento que indique sua função ou sensibilidade. Não capture cookies ou tokens.</w:t>
       </w:r>
     </w:p>
     <w:tbl>
@@ -1081,7 +1111,7 @@
                 <w:sz w:val="23"/>
                 <w:szCs w:val="23"/>
               </w:rPr>
-              <w:t xml:space="preserve">ALTERNATIVA</w:t>
+              <w:t xml:space="preserve">RESULTADO ESPERADO</w:t>
             </w:r>
           </w:p>
           <w:p>
@@ -1094,7 +1124,7 @@
                 <w:sz w:val="23"/>
                 <w:szCs w:val="23"/>
               </w:rPr>
-              <w:t xml:space="preserve">Se o ambiente falhar, use: GET /ftp/acquisitions.md → HTTP/1.1 200 OK, Content-Type: text/markdown. Trate-a como evidência fictícia; não presuma conteúdo que não foi mostrado.</w:t>
+              <w:t xml:space="preserve">Na imagem validada para a aula, a resposta é HTTP 200 e text/markdown. Se sua versão diferir, registre o resultado real e use a evidência impressa para continuar; não tente contornar o comportamento.</w:t>
             </w:r>
           </w:p>
         </w:tc>
@@ -1164,7 +1194,7 @@
         <w:spacing w:after="100" w:before="220"/>
       </w:pPr>
       <w:r>
-        <w:t xml:space="preserve">Etapa 4 — Inventariar e interpretar (8 min)</w:t>
+        <w:t xml:space="preserve">Etapa 4 — Construir o inventário com apoio (8 min)</w:t>
       </w:r>
     </w:p>
     <w:p>
@@ -1177,7 +1207,7 @@
           <w:sz w:val="24"/>
           <w:szCs w:val="24"/>
         </w:rPr>
-        <w:t xml:space="preserve">Preencha ao menos quatro linhas usando somente o ambiente investigado: o arquivo ou recurso observado, a aplicação/rota, os dados relacionados e o container ou plataforma. Para cada ativo, explique função, responsável provável, consequência e evidência.</w:t>
+        <w:t xml:space="preserve">Os ativos já estão nomeados para reduzir a carga inicial. Complete função, responsável provável e consequência usando apenas o ambiente investigado.</w:t>
       </w:r>
     </w:p>
     <w:tbl>
@@ -1193,10 +1223,10 @@
         </w:tblBorders>
       </w:tblPr>
       <w:tblGrid>
-        <w:gridCol w:w="2200"/>
+        <w:gridCol w:w="2400"/>
         <w:gridCol w:w="2700"/>
-        <w:gridCol w:w="2800"/>
-        <w:gridCol w:w="2600"/>
+        <w:gridCol w:w="2700"/>
+        <w:gridCol w:w="2500"/>
       </w:tblGrid>
       <w:tr>
         <w:trPr>
@@ -1204,7 +1234,7 @@
         </w:trPr>
         <w:tc>
           <w:tcPr>
-            <w:tcW w:type="dxa" w:w="2200"/>
+            <w:tcW w:type="dxa" w:w="2400"/>
             <w:shd w:fill="12304A" w:val="clear"/>
             <w:tcMar>
               <w:top w:type="dxa" w:w="120"/>
@@ -1225,7 +1255,7 @@
                 <w:sz w:val="22"/>
                 <w:szCs w:val="22"/>
               </w:rPr>
-              <w:t xml:space="preserve">Ativo/tipo</w:t>
+              <w:t xml:space="preserve">Ativo fornecido</w:t>
             </w:r>
           </w:p>
         </w:tc>
@@ -1252,13 +1282,13 @@
                 <w:sz w:val="22"/>
                 <w:szCs w:val="22"/>
               </w:rPr>
-              <w:t xml:space="preserve">Função/proprietário</w:t>
-            </w:r>
-          </w:p>
-        </w:tc>
-        <w:tc>
-          <w:tcPr>
-            <w:tcW w:type="dxa" w:w="2800"/>
+              <w:t xml:space="preserve">Função/responsável</w:t>
+            </w:r>
+          </w:p>
+        </w:tc>
+        <w:tc>
+          <w:tcPr>
+            <w:tcW w:type="dxa" w:w="2700"/>
             <w:shd w:fill="12304A" w:val="clear"/>
             <w:tcMar>
               <w:top w:type="dxa" w:w="120"/>
@@ -1285,7 +1315,7 @@
         </w:tc>
         <w:tc>
           <w:tcPr>
-            <w:tcW w:type="dxa" w:w="2600"/>
+            <w:tcW w:type="dxa" w:w="2500"/>
             <w:shd w:fill="12304A" w:val="clear"/>
             <w:tcMar>
               <w:top w:type="dxa" w:w="120"/>
@@ -1306,7 +1336,7 @@
                 <w:sz w:val="22"/>
                 <w:szCs w:val="22"/>
               </w:rPr>
-              <w:t xml:space="preserve">Prioridade e evidência</w:t>
+              <w:t xml:space="preserve">Evidência</w:t>
             </w:r>
           </w:p>
         </w:tc>
@@ -1314,7 +1344,34 @@
       <w:tr>
         <w:tc>
           <w:tcPr>
-            <w:tcW w:type="dxa" w:w="2200"/>
+            <w:tcW w:type="dxa" w:w="2400"/>
+            <w:shd w:fill="FFFFFF" w:val="clear"/>
+            <w:tcMar>
+              <w:top w:type="dxa" w:w="120"/>
+              <w:left w:type="dxa" w:w="150"/>
+              <w:bottom w:type="dxa" w:w="120"/>
+              <w:right w:type="dxa" w:w="150"/>
+            </w:tcMar>
+          </w:tcPr>
+          <w:p>
+            <w:pPr>
+              <w:spacing w:after="0" w:line="290"/>
+            </w:pPr>
+            <w:r>
+              <w:rPr>
+                <w:b w:val="false"/>
+                <w:bCs w:val="false"/>
+                <w:color w:val="172B4D"/>
+                <w:sz w:val="22"/>
+                <w:szCs w:val="22"/>
+              </w:rPr>
+              <w:t xml:space="preserve">informação em acquisitions.md</w:t>
+            </w:r>
+          </w:p>
+        </w:tc>
+        <w:tc>
+          <w:tcPr>
+            <w:tcW w:type="dxa" w:w="2700"/>
             <w:shd w:fill="FFFFFF" w:val="clear"/>
             <w:tcMar>
               <w:top w:type="dxa" w:w="120"/>
@@ -1368,55 +1425,28 @@
         </w:tc>
         <w:tc>
           <w:tcPr>
-            <w:tcW w:type="dxa" w:w="2800"/>
-            <w:shd w:fill="FFFFFF" w:val="clear"/>
-            <w:tcMar>
-              <w:top w:type="dxa" w:w="120"/>
-              <w:left w:type="dxa" w:w="150"/>
-              <w:bottom w:type="dxa" w:w="120"/>
-              <w:right w:type="dxa" w:w="150"/>
-            </w:tcMar>
-          </w:tcPr>
-          <w:p>
-            <w:pPr>
-              <w:spacing w:after="0" w:line="290"/>
-            </w:pPr>
-            <w:r>
-              <w:rPr>
-                <w:b w:val="false"/>
-                <w:bCs w:val="false"/>
-                <w:color w:val="172B4D"/>
-                <w:sz w:val="22"/>
-                <w:szCs w:val="22"/>
-              </w:rPr>
-              <w:t xml:space="preserve"/>
-            </w:r>
-          </w:p>
-        </w:tc>
-        <w:tc>
-          <w:tcPr>
-            <w:tcW w:type="dxa" w:w="2600"/>
-            <w:shd w:fill="FFFFFF" w:val="clear"/>
-            <w:tcMar>
-              <w:top w:type="dxa" w:w="120"/>
-              <w:left w:type="dxa" w:w="150"/>
-              <w:bottom w:type="dxa" w:w="120"/>
-              <w:right w:type="dxa" w:w="150"/>
-            </w:tcMar>
-          </w:tcPr>
-          <w:p>
-            <w:pPr>
-              <w:spacing w:after="0" w:line="290"/>
-            </w:pPr>
-            <w:r>
-              <w:rPr>
-                <w:b w:val="false"/>
-                <w:bCs w:val="false"/>
-                <w:color w:val="172B4D"/>
-                <w:sz w:val="22"/>
-                <w:szCs w:val="22"/>
-              </w:rPr>
-              <w:t xml:space="preserve"/>
+            <w:tcW w:type="dxa" w:w="2500"/>
+            <w:shd w:fill="FFFFFF" w:val="clear"/>
+            <w:tcMar>
+              <w:top w:type="dxa" w:w="120"/>
+              <w:left w:type="dxa" w:w="150"/>
+              <w:bottom w:type="dxa" w:w="120"/>
+              <w:right w:type="dxa" w:w="150"/>
+            </w:tcMar>
+          </w:tcPr>
+          <w:p>
+            <w:pPr>
+              <w:spacing w:after="0" w:line="290"/>
+            </w:pPr>
+            <w:r>
+              <w:rPr>
+                <w:b w:val="false"/>
+                <w:bCs w:val="false"/>
+                <w:color w:val="172B4D"/>
+                <w:sz w:val="22"/>
+                <w:szCs w:val="22"/>
+              </w:rPr>
+              <w:t xml:space="preserve">trecho + resposta HTTP</w:t>
             </w:r>
           </w:p>
         </w:tc>
@@ -1424,7 +1454,34 @@
       <w:tr>
         <w:tc>
           <w:tcPr>
-            <w:tcW w:type="dxa" w:w="2200"/>
+            <w:tcW w:type="dxa" w:w="2400"/>
+            <w:shd w:fill="FFFFFF" w:val="clear"/>
+            <w:tcMar>
+              <w:top w:type="dxa" w:w="120"/>
+              <w:left w:type="dxa" w:w="150"/>
+              <w:bottom w:type="dxa" w:w="120"/>
+              <w:right w:type="dxa" w:w="150"/>
+            </w:tcMar>
+          </w:tcPr>
+          <w:p>
+            <w:pPr>
+              <w:spacing w:after="0" w:line="290"/>
+            </w:pPr>
+            <w:r>
+              <w:rPr>
+                <w:b w:val="false"/>
+                <w:bCs w:val="false"/>
+                <w:color w:val="172B4D"/>
+                <w:sz w:val="22"/>
+                <w:szCs w:val="22"/>
+              </w:rPr>
+              <w:t xml:space="preserve">arquivo acquisitions.md</w:t>
+            </w:r>
+          </w:p>
+        </w:tc>
+        <w:tc>
+          <w:tcPr>
+            <w:tcW w:type="dxa" w:w="2700"/>
             <w:shd w:fill="FFFFFF" w:val="clear"/>
             <w:tcMar>
               <w:top w:type="dxa" w:w="120"/>
@@ -1478,55 +1535,28 @@
         </w:tc>
         <w:tc>
           <w:tcPr>
-            <w:tcW w:type="dxa" w:w="2800"/>
-            <w:shd w:fill="FFFFFF" w:val="clear"/>
-            <w:tcMar>
-              <w:top w:type="dxa" w:w="120"/>
-              <w:left w:type="dxa" w:w="150"/>
-              <w:bottom w:type="dxa" w:w="120"/>
-              <w:right w:type="dxa" w:w="150"/>
-            </w:tcMar>
-          </w:tcPr>
-          <w:p>
-            <w:pPr>
-              <w:spacing w:after="0" w:line="290"/>
-            </w:pPr>
-            <w:r>
-              <w:rPr>
-                <w:b w:val="false"/>
-                <w:bCs w:val="false"/>
-                <w:color w:val="172B4D"/>
-                <w:sz w:val="22"/>
-                <w:szCs w:val="22"/>
-              </w:rPr>
-              <w:t xml:space="preserve"/>
-            </w:r>
-          </w:p>
-        </w:tc>
-        <w:tc>
-          <w:tcPr>
-            <w:tcW w:type="dxa" w:w="2600"/>
-            <w:shd w:fill="FFFFFF" w:val="clear"/>
-            <w:tcMar>
-              <w:top w:type="dxa" w:w="120"/>
-              <w:left w:type="dxa" w:w="150"/>
-              <w:bottom w:type="dxa" w:w="120"/>
-              <w:right w:type="dxa" w:w="150"/>
-            </w:tcMar>
-          </w:tcPr>
-          <w:p>
-            <w:pPr>
-              <w:spacing w:after="0" w:line="290"/>
-            </w:pPr>
-            <w:r>
-              <w:rPr>
-                <w:b w:val="false"/>
-                <w:bCs w:val="false"/>
-                <w:color w:val="172B4D"/>
-                <w:sz w:val="22"/>
-                <w:szCs w:val="22"/>
-              </w:rPr>
-              <w:t xml:space="preserve"/>
+            <w:tcW w:type="dxa" w:w="2500"/>
+            <w:shd w:fill="FFFFFF" w:val="clear"/>
+            <w:tcMar>
+              <w:top w:type="dxa" w:w="120"/>
+              <w:left w:type="dxa" w:w="150"/>
+              <w:bottom w:type="dxa" w:w="120"/>
+              <w:right w:type="dxa" w:w="150"/>
+            </w:tcMar>
+          </w:tcPr>
+          <w:p>
+            <w:pPr>
+              <w:spacing w:after="0" w:line="290"/>
+            </w:pPr>
+            <w:r>
+              <w:rPr>
+                <w:b w:val="false"/>
+                <w:bCs w:val="false"/>
+                <w:color w:val="172B4D"/>
+                <w:sz w:val="22"/>
+                <w:szCs w:val="22"/>
+              </w:rPr>
+              <w:t xml:space="preserve">caminho e tipo</w:t>
             </w:r>
           </w:p>
         </w:tc>
@@ -1534,7 +1564,34 @@
       <w:tr>
         <w:tc>
           <w:tcPr>
-            <w:tcW w:type="dxa" w:w="2200"/>
+            <w:tcW w:type="dxa" w:w="2400"/>
+            <w:shd w:fill="FFFFFF" w:val="clear"/>
+            <w:tcMar>
+              <w:top w:type="dxa" w:w="120"/>
+              <w:left w:type="dxa" w:w="150"/>
+              <w:bottom w:type="dxa" w:w="120"/>
+              <w:right w:type="dxa" w:w="150"/>
+            </w:tcMar>
+          </w:tcPr>
+          <w:p>
+            <w:pPr>
+              <w:spacing w:after="0" w:line="290"/>
+            </w:pPr>
+            <w:r>
+              <w:rPr>
+                <w:b w:val="false"/>
+                <w:bCs w:val="false"/>
+                <w:color w:val="172B4D"/>
+                <w:sz w:val="22"/>
+                <w:szCs w:val="22"/>
+              </w:rPr>
+              <w:t xml:space="preserve">rota/serviço web</w:t>
+            </w:r>
+          </w:p>
+        </w:tc>
+        <w:tc>
+          <w:tcPr>
+            <w:tcW w:type="dxa" w:w="2700"/>
             <w:shd w:fill="FFFFFF" w:val="clear"/>
             <w:tcMar>
               <w:top w:type="dxa" w:w="120"/>
@@ -1588,55 +1645,28 @@
         </w:tc>
         <w:tc>
           <w:tcPr>
-            <w:tcW w:type="dxa" w:w="2800"/>
-            <w:shd w:fill="FFFFFF" w:val="clear"/>
-            <w:tcMar>
-              <w:top w:type="dxa" w:w="120"/>
-              <w:left w:type="dxa" w:w="150"/>
-              <w:bottom w:type="dxa" w:w="120"/>
-              <w:right w:type="dxa" w:w="150"/>
-            </w:tcMar>
-          </w:tcPr>
-          <w:p>
-            <w:pPr>
-              <w:spacing w:after="0" w:line="290"/>
-            </w:pPr>
-            <w:r>
-              <w:rPr>
-                <w:b w:val="false"/>
-                <w:bCs w:val="false"/>
-                <w:color w:val="172B4D"/>
-                <w:sz w:val="22"/>
-                <w:szCs w:val="22"/>
-              </w:rPr>
-              <w:t xml:space="preserve"/>
-            </w:r>
-          </w:p>
-        </w:tc>
-        <w:tc>
-          <w:tcPr>
-            <w:tcW w:type="dxa" w:w="2600"/>
-            <w:shd w:fill="FFFFFF" w:val="clear"/>
-            <w:tcMar>
-              <w:top w:type="dxa" w:w="120"/>
-              <w:left w:type="dxa" w:w="150"/>
-              <w:bottom w:type="dxa" w:w="120"/>
-              <w:right w:type="dxa" w:w="150"/>
-            </w:tcMar>
-          </w:tcPr>
-          <w:p>
-            <w:pPr>
-              <w:spacing w:after="0" w:line="290"/>
-            </w:pPr>
-            <w:r>
-              <w:rPr>
-                <w:b w:val="false"/>
-                <w:bCs w:val="false"/>
-                <w:color w:val="172B4D"/>
-                <w:sz w:val="22"/>
-                <w:szCs w:val="22"/>
-              </w:rPr>
-              <w:t xml:space="preserve"/>
+            <w:tcW w:type="dxa" w:w="2500"/>
+            <w:shd w:fill="FFFFFF" w:val="clear"/>
+            <w:tcMar>
+              <w:top w:type="dxa" w:w="120"/>
+              <w:left w:type="dxa" w:w="150"/>
+              <w:bottom w:type="dxa" w:w="120"/>
+              <w:right w:type="dxa" w:w="150"/>
+            </w:tcMar>
+          </w:tcPr>
+          <w:p>
+            <w:pPr>
+              <w:spacing w:after="0" w:line="290"/>
+            </w:pPr>
+            <w:r>
+              <w:rPr>
+                <w:b w:val="false"/>
+                <w:bCs w:val="false"/>
+                <w:color w:val="172B4D"/>
+                <w:sz w:val="22"/>
+                <w:szCs w:val="22"/>
+              </w:rPr>
+              <w:t xml:space="preserve">GET e status</w:t>
             </w:r>
           </w:p>
         </w:tc>
@@ -1644,7 +1674,34 @@
       <w:tr>
         <w:tc>
           <w:tcPr>
-            <w:tcW w:type="dxa" w:w="2200"/>
+            <w:tcW w:type="dxa" w:w="2400"/>
+            <w:shd w:fill="FFFFFF" w:val="clear"/>
+            <w:tcMar>
+              <w:top w:type="dxa" w:w="120"/>
+              <w:left w:type="dxa" w:w="150"/>
+              <w:bottom w:type="dxa" w:w="120"/>
+              <w:right w:type="dxa" w:w="150"/>
+            </w:tcMar>
+          </w:tcPr>
+          <w:p>
+            <w:pPr>
+              <w:spacing w:after="0" w:line="290"/>
+            </w:pPr>
+            <w:r>
+              <w:rPr>
+                <w:b w:val="false"/>
+                <w:bCs w:val="false"/>
+                <w:color w:val="172B4D"/>
+                <w:sz w:val="22"/>
+                <w:szCs w:val="22"/>
+              </w:rPr>
+              <w:t xml:space="preserve">container Juice Shop</w:t>
+            </w:r>
+          </w:p>
+        </w:tc>
+        <w:tc>
+          <w:tcPr>
+            <w:tcW w:type="dxa" w:w="2700"/>
             <w:shd w:fill="FFFFFF" w:val="clear"/>
             <w:tcMar>
               <w:top w:type="dxa" w:w="120"/>
@@ -1698,55 +1755,28 @@
         </w:tc>
         <w:tc>
           <w:tcPr>
-            <w:tcW w:type="dxa" w:w="2800"/>
-            <w:shd w:fill="FFFFFF" w:val="clear"/>
-            <w:tcMar>
-              <w:top w:type="dxa" w:w="120"/>
-              <w:left w:type="dxa" w:w="150"/>
-              <w:bottom w:type="dxa" w:w="120"/>
-              <w:right w:type="dxa" w:w="150"/>
-            </w:tcMar>
-          </w:tcPr>
-          <w:p>
-            <w:pPr>
-              <w:spacing w:after="0" w:line="290"/>
-            </w:pPr>
-            <w:r>
-              <w:rPr>
-                <w:b w:val="false"/>
-                <w:bCs w:val="false"/>
-                <w:color w:val="172B4D"/>
-                <w:sz w:val="22"/>
-                <w:szCs w:val="22"/>
-              </w:rPr>
-              <w:t xml:space="preserve"/>
-            </w:r>
-          </w:p>
-        </w:tc>
-        <w:tc>
-          <w:tcPr>
-            <w:tcW w:type="dxa" w:w="2600"/>
-            <w:shd w:fill="FFFFFF" w:val="clear"/>
-            <w:tcMar>
-              <w:top w:type="dxa" w:w="120"/>
-              <w:left w:type="dxa" w:w="150"/>
-              <w:bottom w:type="dxa" w:w="120"/>
-              <w:right w:type="dxa" w:w="150"/>
-            </w:tcMar>
-          </w:tcPr>
-          <w:p>
-            <w:pPr>
-              <w:spacing w:after="0" w:line="290"/>
-            </w:pPr>
-            <w:r>
-              <w:rPr>
-                <w:b w:val="false"/>
-                <w:bCs w:val="false"/>
-                <w:color w:val="172B4D"/>
-                <w:sz w:val="22"/>
-                <w:szCs w:val="22"/>
-              </w:rPr>
-              <w:t xml:space="preserve"/>
+            <w:tcW w:type="dxa" w:w="2500"/>
+            <w:shd w:fill="FFFFFF" w:val="clear"/>
+            <w:tcMar>
+              <w:top w:type="dxa" w:w="120"/>
+              <w:left w:type="dxa" w:w="150"/>
+              <w:bottom w:type="dxa" w:w="120"/>
+              <w:right w:type="dxa" w:w="150"/>
+            </w:tcMar>
+          </w:tcPr>
+          <w:p>
+            <w:pPr>
+              <w:spacing w:after="0" w:line="290"/>
+            </w:pPr>
+            <w:r>
+              <w:rPr>
+                <w:b w:val="false"/>
+                <w:bCs w:val="false"/>
+                <w:color w:val="172B4D"/>
+                <w:sz w:val="22"/>
+                <w:szCs w:val="22"/>
+              </w:rPr>
+              <w:t xml:space="preserve">docker ps / URL local</w:t>
             </w:r>
           </w:p>
         </w:tc>
@@ -1759,7 +1789,7 @@
         <w:spacing w:after="100" w:before="220"/>
       </w:pPr>
       <w:r>
-        <w:t xml:space="preserve">Etapa 5 — Registrar a vulnerabilidade (9 min)</w:t>
+        <w:t xml:space="preserve">Etapa 5 — Do observado aos conceitos (8 min)</w:t>
       </w:r>
     </w:p>
     <w:p>
@@ -1772,7 +1802,7 @@
           <w:sz w:val="24"/>
           <w:szCs w:val="24"/>
         </w:rPr>
-        <w:t xml:space="preserve">Descreva comportamento esperado e observado. Relacione: ativo; ameaça plausível; fraqueza provável; vulnerabilidade concreta; caminho de exposição; técnica necessária; consequência; limites da hipótese. Não invente um CVE.</w:t>
+        <w:t xml:space="preserve">Use o exemplo iniciado pelo professor. Sua tarefa é justificar, limitar e corrigir as frases — não memorizar definições.</w:t>
       </w:r>
     </w:p>
     <w:tbl>
@@ -1788,8 +1818,9 @@
         </w:tblBorders>
       </w:tblPr>
       <w:tblGrid>
-        <w:gridCol w:w="3300"/>
-        <w:gridCol w:w="7000"/>
+        <w:gridCol w:w="2100"/>
+        <w:gridCol w:w="4300"/>
+        <w:gridCol w:w="3900"/>
       </w:tblGrid>
       <w:tr>
         <w:trPr>
@@ -1797,7 +1828,7 @@
         </w:trPr>
         <w:tc>
           <w:tcPr>
-            <w:tcW w:type="dxa" w:w="3300"/>
+            <w:tcW w:type="dxa" w:w="2100"/>
             <w:shd w:fill="12304A" w:val="clear"/>
             <w:tcMar>
               <w:top w:type="dxa" w:w="120"/>
@@ -1818,13 +1849,13 @@
                 <w:sz w:val="22"/>
                 <w:szCs w:val="22"/>
               </w:rPr>
-              <w:t xml:space="preserve">Campo</w:t>
-            </w:r>
-          </w:p>
-        </w:tc>
-        <w:tc>
-          <w:tcPr>
-            <w:tcW w:type="dxa" w:w="7000"/>
+              <w:t xml:space="preserve">Conceito</w:t>
+            </w:r>
+          </w:p>
+        </w:tc>
+        <w:tc>
+          <w:tcPr>
+            <w:tcW w:type="dxa" w:w="4300"/>
             <w:shd w:fill="12304A" w:val="clear"/>
             <w:tcMar>
               <w:top w:type="dxa" w:w="120"/>
@@ -1845,7 +1876,34 @@
                 <w:sz w:val="22"/>
                 <w:szCs w:val="22"/>
               </w:rPr>
-              <w:t xml:space="preserve">Registro da dupla</w:t>
+              <w:t xml:space="preserve">Ponto de partida</w:t>
+            </w:r>
+          </w:p>
+        </w:tc>
+        <w:tc>
+          <w:tcPr>
+            <w:tcW w:type="dxa" w:w="3900"/>
+            <w:shd w:fill="12304A" w:val="clear"/>
+            <w:tcMar>
+              <w:top w:type="dxa" w:w="120"/>
+              <w:left w:type="dxa" w:w="150"/>
+              <w:bottom w:type="dxa" w:w="120"/>
+              <w:right w:type="dxa" w:w="150"/>
+            </w:tcMar>
+          </w:tcPr>
+          <w:p>
+            <w:pPr>
+              <w:spacing w:after="0" w:line="290"/>
+            </w:pPr>
+            <w:r>
+              <w:rPr>
+                <w:b/>
+                <w:bCs/>
+                <w:color w:val="FFFFFF"/>
+                <w:sz w:val="22"/>
+                <w:szCs w:val="22"/>
+              </w:rPr>
+              <w:t xml:space="preserve">Justificativa ou limite da dupla</w:t>
             </w:r>
           </w:p>
         </w:tc>
@@ -1853,34 +1911,61 @@
       <w:tr>
         <w:tc>
           <w:tcPr>
-            <w:tcW w:type="dxa" w:w="3300"/>
-            <w:shd w:fill="FFFFFF" w:val="clear"/>
-            <w:tcMar>
-              <w:top w:type="dxa" w:w="120"/>
-              <w:left w:type="dxa" w:w="150"/>
-              <w:bottom w:type="dxa" w:w="120"/>
-              <w:right w:type="dxa" w:w="150"/>
-            </w:tcMar>
-          </w:tcPr>
-          <w:p>
-            <w:pPr>
-              <w:spacing w:after="0" w:line="290"/>
-            </w:pPr>
-            <w:r>
-              <w:rPr>
-                <w:b w:val="false"/>
-                <w:bCs w:val="false"/>
-                <w:color w:val="172B4D"/>
-                <w:sz w:val="22"/>
-                <w:szCs w:val="22"/>
-              </w:rPr>
-              <w:t xml:space="preserve">Evidência reproduzível e interpretação</w:t>
-            </w:r>
-          </w:p>
-        </w:tc>
-        <w:tc>
-          <w:tcPr>
-            <w:tcW w:type="dxa" w:w="7000"/>
+            <w:tcW w:type="dxa" w:w="2100"/>
+            <w:shd w:fill="FFFFFF" w:val="clear"/>
+            <w:tcMar>
+              <w:top w:type="dxa" w:w="120"/>
+              <w:left w:type="dxa" w:w="150"/>
+              <w:bottom w:type="dxa" w:w="120"/>
+              <w:right w:type="dxa" w:w="150"/>
+            </w:tcMar>
+          </w:tcPr>
+          <w:p>
+            <w:pPr>
+              <w:spacing w:after="0" w:line="290"/>
+            </w:pPr>
+            <w:r>
+              <w:rPr>
+                <w:b w:val="false"/>
+                <w:bCs w:val="false"/>
+                <w:color w:val="172B4D"/>
+                <w:sz w:val="22"/>
+                <w:szCs w:val="22"/>
+              </w:rPr>
+              <w:t xml:space="preserve">Ativo</w:t>
+            </w:r>
+          </w:p>
+        </w:tc>
+        <w:tc>
+          <w:tcPr>
+            <w:tcW w:type="dxa" w:w="4300"/>
+            <w:shd w:fill="FFFFFF" w:val="clear"/>
+            <w:tcMar>
+              <w:top w:type="dxa" w:w="120"/>
+              <w:left w:type="dxa" w:w="150"/>
+              <w:bottom w:type="dxa" w:w="120"/>
+              <w:right w:type="dxa" w:w="150"/>
+            </w:tcMar>
+          </w:tcPr>
+          <w:p>
+            <w:pPr>
+              <w:spacing w:after="0" w:line="290"/>
+            </w:pPr>
+            <w:r>
+              <w:rPr>
+                <w:b w:val="false"/>
+                <w:bCs w:val="false"/>
+                <w:color w:val="172B4D"/>
+                <w:sz w:val="22"/>
+                <w:szCs w:val="22"/>
+              </w:rPr>
+              <w:t xml:space="preserve">a informação e o arquivo têm valor para o cenário</w:t>
+            </w:r>
+          </w:p>
+        </w:tc>
+        <w:tc>
+          <w:tcPr>
+            <w:tcW w:type="dxa" w:w="3900"/>
             <w:shd w:fill="FFFFFF" w:val="clear"/>
             <w:tcMar>
               <w:top w:type="dxa" w:w="120"/>
@@ -1909,34 +1994,61 @@
       <w:tr>
         <w:tc>
           <w:tcPr>
-            <w:tcW w:type="dxa" w:w="3300"/>
-            <w:shd w:fill="FFFFFF" w:val="clear"/>
-            <w:tcMar>
-              <w:top w:type="dxa" w:w="120"/>
-              <w:left w:type="dxa" w:w="150"/>
-              <w:bottom w:type="dxa" w:w="120"/>
-              <w:right w:type="dxa" w:w="150"/>
-            </w:tcMar>
-          </w:tcPr>
-          <w:p>
-            <w:pPr>
-              <w:spacing w:after="0" w:line="290"/>
-            </w:pPr>
-            <w:r>
-              <w:rPr>
-                <w:b w:val="false"/>
-                <w:bCs w:val="false"/>
-                <w:color w:val="172B4D"/>
-                <w:sz w:val="22"/>
-                <w:szCs w:val="22"/>
-              </w:rPr>
-              <w:t xml:space="preserve">Fraqueza provável e lacuna</w:t>
-            </w:r>
-          </w:p>
-        </w:tc>
-        <w:tc>
-          <w:tcPr>
-            <w:tcW w:type="dxa" w:w="7000"/>
+            <w:tcW w:type="dxa" w:w="2100"/>
+            <w:shd w:fill="FFFFFF" w:val="clear"/>
+            <w:tcMar>
+              <w:top w:type="dxa" w:w="120"/>
+              <w:left w:type="dxa" w:w="150"/>
+              <w:bottom w:type="dxa" w:w="120"/>
+              <w:right w:type="dxa" w:w="150"/>
+            </w:tcMar>
+          </w:tcPr>
+          <w:p>
+            <w:pPr>
+              <w:spacing w:after="0" w:line="290"/>
+            </w:pPr>
+            <w:r>
+              <w:rPr>
+                <w:b w:val="false"/>
+                <w:bCs w:val="false"/>
+                <w:color w:val="172B4D"/>
+                <w:sz w:val="22"/>
+                <w:szCs w:val="22"/>
+              </w:rPr>
+              <w:t xml:space="preserve">Ameaça</w:t>
+            </w:r>
+          </w:p>
+        </w:tc>
+        <w:tc>
+          <w:tcPr>
+            <w:tcW w:type="dxa" w:w="4300"/>
+            <w:shd w:fill="FFFFFF" w:val="clear"/>
+            <w:tcMar>
+              <w:top w:type="dxa" w:w="120"/>
+              <w:left w:type="dxa" w:w="150"/>
+              <w:bottom w:type="dxa" w:w="120"/>
+              <w:right w:type="dxa" w:w="150"/>
+            </w:tcMar>
+          </w:tcPr>
+          <w:p>
+            <w:pPr>
+              <w:spacing w:after="0" w:line="290"/>
+            </w:pPr>
+            <w:r>
+              <w:rPr>
+                <w:b w:val="false"/>
+                <w:bCs w:val="false"/>
+                <w:color w:val="172B4D"/>
+                <w:sz w:val="22"/>
+                <w:szCs w:val="22"/>
+              </w:rPr>
+              <w:t xml:space="preserve">alguém sem autorização pode obter a informação</w:t>
+            </w:r>
+          </w:p>
+        </w:tc>
+        <w:tc>
+          <w:tcPr>
+            <w:tcW w:type="dxa" w:w="3900"/>
             <w:shd w:fill="FFFFFF" w:val="clear"/>
             <w:tcMar>
               <w:top w:type="dxa" w:w="120"/>
@@ -1965,34 +2077,61 @@
       <w:tr>
         <w:tc>
           <w:tcPr>
-            <w:tcW w:type="dxa" w:w="3300"/>
-            <w:shd w:fill="FFFFFF" w:val="clear"/>
-            <w:tcMar>
-              <w:top w:type="dxa" w:w="120"/>
-              <w:left w:type="dxa" w:w="150"/>
-              <w:bottom w:type="dxa" w:w="120"/>
-              <w:right w:type="dxa" w:w="150"/>
-            </w:tcMar>
-          </w:tcPr>
-          <w:p>
-            <w:pPr>
-              <w:spacing w:after="0" w:line="290"/>
-            </w:pPr>
-            <w:r>
-              <w:rPr>
-                <w:b w:val="false"/>
-                <w:bCs w:val="false"/>
-                <w:color w:val="172B4D"/>
-                <w:sz w:val="22"/>
-                <w:szCs w:val="22"/>
-              </w:rPr>
-              <w:t xml:space="preserve">Vetor/ameaça dentro do escopo</w:t>
-            </w:r>
-          </w:p>
-        </w:tc>
-        <w:tc>
-          <w:tcPr>
-            <w:tcW w:type="dxa" w:w="7000"/>
+            <w:tcW w:type="dxa" w:w="2100"/>
+            <w:shd w:fill="FFFFFF" w:val="clear"/>
+            <w:tcMar>
+              <w:top w:type="dxa" w:w="120"/>
+              <w:left w:type="dxa" w:w="150"/>
+              <w:bottom w:type="dxa" w:w="120"/>
+              <w:right w:type="dxa" w:w="150"/>
+            </w:tcMar>
+          </w:tcPr>
+          <w:p>
+            <w:pPr>
+              <w:spacing w:after="0" w:line="290"/>
+            </w:pPr>
+            <w:r>
+              <w:rPr>
+                <w:b w:val="false"/>
+                <w:bCs w:val="false"/>
+                <w:color w:val="172B4D"/>
+                <w:sz w:val="22"/>
+                <w:szCs w:val="22"/>
+              </w:rPr>
+              <w:t xml:space="preserve">Fraqueza — hipótese</w:t>
+            </w:r>
+          </w:p>
+        </w:tc>
+        <w:tc>
+          <w:tcPr>
+            <w:tcW w:type="dxa" w:w="4300"/>
+            <w:shd w:fill="FFFFFF" w:val="clear"/>
+            <w:tcMar>
+              <w:top w:type="dxa" w:w="120"/>
+              <w:left w:type="dxa" w:w="150"/>
+              <w:bottom w:type="dxa" w:w="120"/>
+              <w:right w:type="dxa" w:w="150"/>
+            </w:tcMar>
+          </w:tcPr>
+          <w:p>
+            <w:pPr>
+              <w:spacing w:after="0" w:line="290"/>
+            </w:pPr>
+            <w:r>
+              <w:rPr>
+                <w:b w:val="false"/>
+                <w:bCs w:val="false"/>
+                <w:color w:val="172B4D"/>
+                <w:sz w:val="22"/>
+                <w:szCs w:val="22"/>
+              </w:rPr>
+              <w:t xml:space="preserve">arquivo em área servida ou autorização ausente</w:t>
+            </w:r>
+          </w:p>
+        </w:tc>
+        <w:tc>
+          <w:tcPr>
+            <w:tcW w:type="dxa" w:w="3900"/>
             <w:shd w:fill="FFFFFF" w:val="clear"/>
             <w:tcMar>
               <w:top w:type="dxa" w:w="120"/>
@@ -2021,34 +2160,61 @@
       <w:tr>
         <w:tc>
           <w:tcPr>
-            <w:tcW w:type="dxa" w:w="3300"/>
-            <w:shd w:fill="FFFFFF" w:val="clear"/>
-            <w:tcMar>
-              <w:top w:type="dxa" w:w="120"/>
-              <w:left w:type="dxa" w:w="150"/>
-              <w:bottom w:type="dxa" w:w="120"/>
-              <w:right w:type="dxa" w:w="150"/>
-            </w:tcMar>
-          </w:tcPr>
-          <w:p>
-            <w:pPr>
-              <w:spacing w:after="0" w:line="290"/>
-            </w:pPr>
-            <w:r>
-              <w:rPr>
-                <w:b w:val="false"/>
-                <w:bCs w:val="false"/>
-                <w:color w:val="172B4D"/>
-                <w:sz w:val="22"/>
-                <w:szCs w:val="22"/>
-              </w:rPr>
-              <w:t xml:space="preserve">Consequência e prioridade</w:t>
-            </w:r>
-          </w:p>
-        </w:tc>
-        <w:tc>
-          <w:tcPr>
-            <w:tcW w:type="dxa" w:w="7000"/>
+            <w:tcW w:type="dxa" w:w="2100"/>
+            <w:shd w:fill="FFFFFF" w:val="clear"/>
+            <w:tcMar>
+              <w:top w:type="dxa" w:w="120"/>
+              <w:left w:type="dxa" w:w="150"/>
+              <w:bottom w:type="dxa" w:w="120"/>
+              <w:right w:type="dxa" w:w="150"/>
+            </w:tcMar>
+          </w:tcPr>
+          <w:p>
+            <w:pPr>
+              <w:spacing w:after="0" w:line="290"/>
+            </w:pPr>
+            <w:r>
+              <w:rPr>
+                <w:b w:val="false"/>
+                <w:bCs w:val="false"/>
+                <w:color w:val="172B4D"/>
+                <w:sz w:val="22"/>
+                <w:szCs w:val="22"/>
+              </w:rPr>
+              <w:t xml:space="preserve">Vulnerabilidade observada</w:t>
+            </w:r>
+          </w:p>
+        </w:tc>
+        <w:tc>
+          <w:tcPr>
+            <w:tcW w:type="dxa" w:w="4300"/>
+            <w:shd w:fill="FFFFFF" w:val="clear"/>
+            <w:tcMar>
+              <w:top w:type="dxa" w:w="120"/>
+              <w:left w:type="dxa" w:w="150"/>
+              <w:bottom w:type="dxa" w:w="120"/>
+              <w:right w:type="dxa" w:w="150"/>
+            </w:tcMar>
+          </w:tcPr>
+          <w:p>
+            <w:pPr>
+              <w:spacing w:after="0" w:line="290"/>
+            </w:pPr>
+            <w:r>
+              <w:rPr>
+                <w:b w:val="false"/>
+                <w:bCs w:val="false"/>
+                <w:color w:val="172B4D"/>
+                <w:sz w:val="22"/>
+                <w:szCs w:val="22"/>
+              </w:rPr>
+              <w:t xml:space="preserve">esta implantação entrega o arquivo sem login</w:t>
+            </w:r>
+          </w:p>
+        </w:tc>
+        <w:tc>
+          <w:tcPr>
+            <w:tcW w:type="dxa" w:w="3900"/>
             <w:shd w:fill="FFFFFF" w:val="clear"/>
             <w:tcMar>
               <w:top w:type="dxa" w:w="120"/>
@@ -2077,34 +2243,144 @@
       <w:tr>
         <w:tc>
           <w:tcPr>
-            <w:tcW w:type="dxa" w:w="3300"/>
-            <w:shd w:fill="FFFFFF" w:val="clear"/>
-            <w:tcMar>
-              <w:top w:type="dxa" w:w="120"/>
-              <w:left w:type="dxa" w:w="150"/>
-              <w:bottom w:type="dxa" w:w="120"/>
-              <w:right w:type="dxa" w:w="150"/>
-            </w:tcMar>
-          </w:tcPr>
-          <w:p>
-            <w:pPr>
-              <w:spacing w:after="0" w:line="290"/>
-            </w:pPr>
-            <w:r>
-              <w:rPr>
-                <w:b w:val="false"/>
-                <w:bCs w:val="false"/>
-                <w:color w:val="172B4D"/>
-                <w:sz w:val="22"/>
-                <w:szCs w:val="22"/>
-              </w:rPr>
-              <w:t xml:space="preserve">Limites e próxima evidência</w:t>
-            </w:r>
-          </w:p>
-        </w:tc>
-        <w:tc>
-          <w:tcPr>
-            <w:tcW w:type="dxa" w:w="7000"/>
+            <w:tcW w:type="dxa" w:w="2100"/>
+            <w:shd w:fill="FFFFFF" w:val="clear"/>
+            <w:tcMar>
+              <w:top w:type="dxa" w:w="120"/>
+              <w:left w:type="dxa" w:w="150"/>
+              <w:bottom w:type="dxa" w:w="120"/>
+              <w:right w:type="dxa" w:w="150"/>
+            </w:tcMar>
+          </w:tcPr>
+          <w:p>
+            <w:pPr>
+              <w:spacing w:after="0" w:line="290"/>
+            </w:pPr>
+            <w:r>
+              <w:rPr>
+                <w:b w:val="false"/>
+                <w:bCs w:val="false"/>
+                <w:color w:val="172B4D"/>
+                <w:sz w:val="22"/>
+                <w:szCs w:val="22"/>
+              </w:rPr>
+              <w:t xml:space="preserve">Exposição/vetor</w:t>
+            </w:r>
+          </w:p>
+        </w:tc>
+        <w:tc>
+          <w:tcPr>
+            <w:tcW w:type="dxa" w:w="4300"/>
+            <w:shd w:fill="FFFFFF" w:val="clear"/>
+            <w:tcMar>
+              <w:top w:type="dxa" w:w="120"/>
+              <w:left w:type="dxa" w:w="150"/>
+              <w:bottom w:type="dxa" w:w="120"/>
+              <w:right w:type="dxa" w:w="150"/>
+            </w:tcMar>
+          </w:tcPr>
+          <w:p>
+            <w:pPr>
+              <w:spacing w:after="0" w:line="290"/>
+            </w:pPr>
+            <w:r>
+              <w:rPr>
+                <w:b w:val="false"/>
+                <w:bCs w:val="false"/>
+                <w:color w:val="172B4D"/>
+                <w:sz w:val="22"/>
+                <w:szCs w:val="22"/>
+              </w:rPr>
+              <w:t xml:space="preserve">requisição HTTP GET para a rota fornecida</w:t>
+            </w:r>
+          </w:p>
+        </w:tc>
+        <w:tc>
+          <w:tcPr>
+            <w:tcW w:type="dxa" w:w="3900"/>
+            <w:shd w:fill="FFFFFF" w:val="clear"/>
+            <w:tcMar>
+              <w:top w:type="dxa" w:w="120"/>
+              <w:left w:type="dxa" w:w="150"/>
+              <w:bottom w:type="dxa" w:w="120"/>
+              <w:right w:type="dxa" w:w="150"/>
+            </w:tcMar>
+          </w:tcPr>
+          <w:p>
+            <w:pPr>
+              <w:spacing w:after="0" w:line="290"/>
+            </w:pPr>
+            <w:r>
+              <w:rPr>
+                <w:b w:val="false"/>
+                <w:bCs w:val="false"/>
+                <w:color w:val="172B4D"/>
+                <w:sz w:val="22"/>
+                <w:szCs w:val="22"/>
+              </w:rPr>
+              <w:t xml:space="preserve"/>
+            </w:r>
+          </w:p>
+        </w:tc>
+      </w:tr>
+      <w:tr>
+        <w:tc>
+          <w:tcPr>
+            <w:tcW w:type="dxa" w:w="2100"/>
+            <w:shd w:fill="FFFFFF" w:val="clear"/>
+            <w:tcMar>
+              <w:top w:type="dxa" w:w="120"/>
+              <w:left w:type="dxa" w:w="150"/>
+              <w:bottom w:type="dxa" w:w="120"/>
+              <w:right w:type="dxa" w:w="150"/>
+            </w:tcMar>
+          </w:tcPr>
+          <w:p>
+            <w:pPr>
+              <w:spacing w:after="0" w:line="290"/>
+            </w:pPr>
+            <w:r>
+              <w:rPr>
+                <w:b w:val="false"/>
+                <w:bCs w:val="false"/>
+                <w:color w:val="172B4D"/>
+                <w:sz w:val="22"/>
+                <w:szCs w:val="22"/>
+              </w:rPr>
+              <w:t xml:space="preserve">Consequência</w:t>
+            </w:r>
+          </w:p>
+        </w:tc>
+        <w:tc>
+          <w:tcPr>
+            <w:tcW w:type="dxa" w:w="4300"/>
+            <w:shd w:fill="FFFFFF" w:val="clear"/>
+            <w:tcMar>
+              <w:top w:type="dxa" w:w="120"/>
+              <w:left w:type="dxa" w:w="150"/>
+              <w:bottom w:type="dxa" w:w="120"/>
+              <w:right w:type="dxa" w:w="150"/>
+            </w:tcMar>
+          </w:tcPr>
+          <w:p>
+            <w:pPr>
+              <w:spacing w:after="0" w:line="290"/>
+            </w:pPr>
+            <w:r>
+              <w:rPr>
+                <w:b w:val="false"/>
+                <w:bCs w:val="false"/>
+                <w:color w:val="172B4D"/>
+                <w:sz w:val="22"/>
+                <w:szCs w:val="22"/>
+              </w:rPr>
+              <w:t xml:space="preserve">divulgação de planos fictícios de aquisição</w:t>
+            </w:r>
+          </w:p>
+        </w:tc>
+        <w:tc>
+          <w:tcPr>
+            <w:tcW w:type="dxa" w:w="3900"/>
             <w:shd w:fill="FFFFFF" w:val="clear"/>
             <w:tcMar>
               <w:top w:type="dxa" w:w="120"/>
@@ -2149,7 +2425,7 @@
       <w:tr>
         <w:tc>
           <w:tcPr>
-            <w:shd w:fill="B75D00" w:val="clear"/>
+            <w:shd w:fill="087F7A" w:val="clear"/>
             <w:tcMar>
               <w:top w:type="dxa" w:w="145"/>
               <w:left w:type="dxa" w:w="180"/>
@@ -2169,7 +2445,7 @@
                 <w:sz w:val="23"/>
                 <w:szCs w:val="23"/>
               </w:rPr>
-              <w:t xml:space="preserve">DECISÃO</w:t>
+              <w:t xml:space="preserve">DISTINÇÃO</w:t>
             </w:r>
           </w:p>
           <w:p>
@@ -2182,6 +2458,63 @@
                 <w:sz w:val="23"/>
                 <w:szCs w:val="23"/>
               </w:rPr>
+              <w:t xml:space="preserve">Fraqueza explica uma condição provável e ainda exige arquitetura/configuração para confirmação. Vulnerabilidade, nesta atividade, é a instância concreta observada: a implantação entrega o recurso sem a restrição esperada.</w:t>
+            </w:r>
+          </w:p>
+        </w:tc>
+      </w:tr>
+    </w:tbl>
+    <w:tbl>
+      <w:tblPr>
+        <w:tblW w:type="pct" w:w="100%"/>
+        <w:tblBorders>
+          <w:top w:val="single" w:color="auto" w:sz="4"/>
+          <w:left w:val="single" w:color="auto" w:sz="4"/>
+          <w:bottom w:val="single" w:color="auto" w:sz="4"/>
+          <w:right w:val="single" w:color="auto" w:sz="4"/>
+          <w:insideH w:val="single" w:color="auto" w:sz="4"/>
+          <w:insideV w:val="single" w:color="auto" w:sz="4"/>
+        </w:tblBorders>
+      </w:tblPr>
+      <w:tblGrid>
+        <w:gridCol w:w="100"/>
+      </w:tblGrid>
+      <w:tr>
+        <w:tc>
+          <w:tcPr>
+            <w:shd w:fill="B75D00" w:val="clear"/>
+            <w:tcMar>
+              <w:top w:type="dxa" w:w="145"/>
+              <w:left w:type="dxa" w:w="180"/>
+              <w:bottom w:type="dxa" w:w="145"/>
+              <w:right w:type="dxa" w:w="180"/>
+            </w:tcMar>
+          </w:tcPr>
+          <w:p>
+            <w:pPr>
+              <w:spacing w:after="65"/>
+            </w:pPr>
+            <w:r>
+              <w:rPr>
+                <w:b/>
+                <w:bCs/>
+                <w:color w:val="FFFFFF"/>
+                <w:sz w:val="23"/>
+                <w:szCs w:val="23"/>
+              </w:rPr>
+              <w:t xml:space="preserve">DECISÃO</w:t>
+            </w:r>
+          </w:p>
+          <w:p>
+            <w:pPr>
+              <w:spacing w:line="315"/>
+            </w:pPr>
+            <w:r>
+              <w:rPr>
+                <w:color w:val="FFFFFF"/>
+                <w:sz w:val="23"/>
+                <w:szCs w:val="23"/>
+              </w:rPr>
               <w:t xml:space="preserve">Escolha uma prioridade pela consequência, não pela obtenção de uma flag. Explique o que mudaria a prioridade.</w:t>
             </w:r>
           </w:p>
@@ -2195,7 +2528,7 @@
         <w:spacing w:after="100" w:before="220"/>
       </w:pPr>
       <w:r>
-        <w:t xml:space="preserve">Etapa 6 — Tratar e validar (8 min)</w:t>
+        <w:t xml:space="preserve">Etapa 6 — Compreender, escolher e validar um controle (7 min)</w:t>
       </w:r>
     </w:p>
     <w:p>
@@ -2208,7 +2541,7 @@
           <w:sz w:val="24"/>
           <w:szCs w:val="24"/>
         </w:rPr>
-        <w:t xml:space="preserve">Compare as opções e recomende uma conforme a função do recurso.</w:t>
+        <w:t xml:space="preserve">Controle é uma medida que modifica o risco: pode prevenir, detectar, corrigir ou apoiar recuperação. Uma ferramenta só se torna controle quando possui finalidade, responsável e forma de verificar seu funcionamento. Classifique as opções abaixo e recomende uma conforme a função do recurso.</w:t>
       </w:r>
     </w:p>
     <w:tbl>

</xml_diff>